<commit_message>
feat: belge okuma ve proje kanıtlarını güncelle
</commit_message>
<xml_diff>
--- a/shared/templates/MAHIR_Veri_Giris_Sablonu.docx
+++ b/shared/templates/MAHIR_Veri_Giris_Sablonu.docx
@@ -1,12 +1,14 @@
 
 <file path=word/document.xml><?xml version="1.0" encoding="utf-8"?>
-<w:document xmlns:wpc="http://schemas.microsoft.com/office/word/2010/wordprocessingCanvas" xmlns:cx="http://schemas.microsoft.com/office/drawing/2014/chartex" xmlns:cx1="http://schemas.microsoft.com/office/drawing/2015/9/8/chartex" xmlns:cx2="http://schemas.microsoft.com/office/drawing/2015/10/21/chartex" xmlns:cx3="http://schemas.microsoft.com/office/drawing/2016/5/9/chartex" xmlns:cx4="http://schemas.microsoft.com/office/drawing/2016/5/10/chartex" xmlns:cx5="http://schemas.microsoft.com/office/drawing/2016/5/11/chartex" xmlns:cx6="http://schemas.microsoft.com/office/drawing/2016/5/12/chartex" xmlns:cx7="http://schemas.microsoft.com/office/drawing/2016/5/13/chartex" xmlns:cx8="http://schemas.microsoft.com/office/drawing/2016/5/14/chartex" xmlns:mc="http://schemas.openxmlformats.org/markup-compatibility/2006" xmlns:aink="http://schemas.microsoft.com/office/drawing/2016/ink" xmlns:am3d="http://schemas.microsoft.com/office/drawing/2017/model3d" xmlns:o="urn:schemas-microsoft-com:office:office" xmlns:oel="http://schemas.microsoft.com/office/2019/extlst" xmlns:r="http://schemas.openxmlformats.org/officeDocument/2006/relationships" xmlns:m="http://schemas.openxmlformats.org/officeDocument/2006/math" xmlns:v="urn:schemas-microsoft-com:vml" xmlns:wp14="http://schemas.microsoft.com/office/word/2010/wordprocessingDrawing" xmlns:wp="http://schemas.openxmlformats.org/drawingml/2006/wordprocessingDrawing" xmlns:w10="urn:schemas-microsoft-com:office:word" xmlns:w="http://schemas.openxmlformats.org/wordprocessingml/2006/main" xmlns:w14="http://schemas.microsoft.com/office/word/2010/wordml" xmlns:w15="http://schemas.microsoft.com/office/word/2012/wordml" xmlns:w16cei="http://schemas.microsoft.com/office/word/2026/wordml/cei" xmlns:w16cex="http://schemas.microsoft.com/office/word/2018/wordml/cex" xmlns:w16cid="http://schemas.microsoft.com/office/word/2016/wordml/cid" xmlns:w16="http://schemas.microsoft.com/office/word/2018/wordml" xmlns:w16du="http://schemas.microsoft.com/office/word/2023/wordml/word16du" xmlns:w16sdtdh="http://schemas.microsoft.com/office/word/2020/wordml/sdtdatahash" xmlns:w16sdtfl="http://schemas.microsoft.com/office/word/2024/wordml/sdtformatlock" xmlns:w16se="http://schemas.microsoft.com/office/word/2015/wordml/symex" xmlns:wpg="http://schemas.microsoft.com/office/word/2010/wordprocessingGroup" xmlns:wpi="http://schemas.microsoft.com/office/word/2010/wordprocessingInk" xmlns:wne="http://schemas.microsoft.com/office/word/2006/wordml" xmlns:wps="http://schemas.microsoft.com/office/word/2010/wordprocessingShape" mc:Ignorable="w14 w15 w16se w16cid w16 w16cex w16sdtdh w16sdtfl w16du wp14">
+<w:document xmlns:wpc="http://schemas.microsoft.com/office/word/2010/wordprocessingCanvas" xmlns:cx="http://schemas.microsoft.com/office/drawing/2014/chartex" xmlns:cx1="http://schemas.microsoft.com/office/drawing/2015/9/8/chartex" xmlns:cx2="http://schemas.microsoft.com/office/drawing/2015/10/21/chartex" xmlns:cx3="http://schemas.microsoft.com/office/drawing/2016/5/9/chartex" xmlns:cx4="http://schemas.microsoft.com/office/drawing/2016/5/10/chartex" xmlns:cx5="http://schemas.microsoft.com/office/drawing/2016/5/11/chartex" xmlns:cx6="http://schemas.microsoft.com/office/drawing/2016/5/12/chartex" xmlns:cx7="http://schemas.microsoft.com/office/drawing/2016/5/13/chartex" xmlns:cx8="http://schemas.microsoft.com/office/drawing/2016/5/14/chartex" xmlns:mc="http://schemas.openxmlformats.org/markup-compatibility/2006" xmlns:aink="http://schemas.microsoft.com/office/drawing/2016/ink" xmlns:am3d="http://schemas.microsoft.com/office/drawing/2017/model3d" xmlns:o="urn:schemas-microsoft-com:office:office" xmlns:oel="http://schemas.microsoft.com/office/2019/extlst" xmlns:r="http://schemas.openxmlformats.org/officeDocument/2006/relationships" xmlns:m="http://schemas.openxmlformats.org/officeDocument/2006/math" xmlns:v="urn:schemas-microsoft-com:vml" xmlns:wp14="http://schemas.microsoft.com/office/word/2010/wordprocessingDrawing" xmlns:wp="http://schemas.openxmlformats.org/drawingml/2006/wordprocessingDrawing" xmlns:w10="urn:schemas-microsoft-com:office:word" xmlns:w="http://schemas.openxmlformats.org/wordprocessingml/2006/main" xmlns:w14="http://schemas.microsoft.com/office/word/2010/wordml" xmlns:w15="http://schemas.microsoft.com/office/word/2012/wordml" xmlns:w16cex="http://schemas.microsoft.com/office/word/2018/wordml/cex" xmlns:w16cid="http://schemas.microsoft.com/office/word/2016/wordml/cid" xmlns:w16="http://schemas.microsoft.com/office/word/2018/wordml" xmlns:w16du="http://schemas.microsoft.com/office/word/2023/wordml/word16du" xmlns:w16sdtdh="http://schemas.microsoft.com/office/word/2020/wordml/sdtdatahash" xmlns:w16sdtfl="http://schemas.microsoft.com/office/word/2024/wordml/sdtformatlock" xmlns:w16se="http://schemas.microsoft.com/office/word/2015/wordml/symex" xmlns:wpg="http://schemas.microsoft.com/office/word/2010/wordprocessingGroup" xmlns:wpi="http://schemas.microsoft.com/office/word/2010/wordprocessingInk" xmlns:wne="http://schemas.microsoft.com/office/word/2006/wordml" xmlns:wps="http://schemas.microsoft.com/office/word/2010/wordprocessingShape" mc:Ignorable="w14 w15 w16se w16cid w16 w16cex w16sdtdh w16sdtfl w16du wp14">
   <w:body>
     <w:p>
       <w:pPr>
         <w:spacing w:after="40"/>
         <w:jc w:val="center"/>
         <w:rPr>
+          <w:b/>
+          <w:color w:val="17365D"/>
           <w:sz w:val="28"/>
           <w:szCs w:val="28"/>
         </w:rPr>
@@ -23,8 +25,8 @@
     </w:p>
     <w:tbl>
       <w:tblPr>
-        <w:tblW w:w="0" w:type="auto"/>
-        <w:jc w:val="center"/>
+        <w:tblpPr w:leftFromText="141" w:rightFromText="141" w:vertAnchor="text" w:horzAnchor="margin" w:tblpXSpec="center" w:tblpY="202"/>
+        <w:tblW w:w="4491" w:type="pct"/>
         <w:tblBorders>
           <w:top w:val="single" w:sz="5" w:space="0" w:color="7F8C8D"/>
           <w:left w:val="single" w:sz="5" w:space="0" w:color="7F8C8D"/>
@@ -37,20 +39,19 @@
         <w:tblLook w:val="04A0" w:firstRow="1" w:lastRow="0" w:firstColumn="1" w:lastColumn="0" w:noHBand="0" w:noVBand="1"/>
       </w:tblPr>
       <w:tblGrid>
-        <w:gridCol w:w="2495"/>
-        <w:gridCol w:w="5420"/>
-        <w:gridCol w:w="1984"/>
-        <w:gridCol w:w="3026"/>
+        <w:gridCol w:w="2729"/>
+        <w:gridCol w:w="6727"/>
+        <w:gridCol w:w="1735"/>
+        <w:gridCol w:w="3491"/>
       </w:tblGrid>
       <w:tr>
         <w:trPr>
-          <w:trHeight w:hRule="exact" w:val="249"/>
-          <w:jc w:val="center"/>
+          <w:trHeight w:hRule="exact" w:val="224"/>
         </w:trPr>
         <w:tc>
           <w:tcPr>
-            <w:tcW w:w="2495" w:type="dxa"/>
-            <w:shd w:val="clear" w:color="auto" w:fill="F2F6FA"/>
+            <w:tcW w:w="929" w:type="pct"/>
+            <w:shd w:val="clear" w:color="auto" w:fill="C6D9F1" w:themeFill="text2" w:themeFillTint="33"/>
             <w:tcMar>
               <w:top w:w="60" w:type="dxa"/>
               <w:left w:w="80" w:type="dxa"/>
@@ -62,6 +63,12 @@
           <w:p>
             <w:pPr>
               <w:spacing w:after="0" w:line="240" w:lineRule="auto"/>
+              <w:rPr>
+                <w:rFonts w:ascii="Times New Roman" w:hAnsi="Times New Roman" w:cs="Times New Roman"/>
+                <w:b/>
+                <w:sz w:val="16"/>
+                <w:szCs w:val="16"/>
+              </w:rPr>
             </w:pPr>
             <w:r>
               <w:rPr>
@@ -75,7 +82,7 @@
         </w:tc>
         <w:tc>
           <w:tcPr>
-            <w:tcW w:w="5420" w:type="dxa"/>
+            <w:tcW w:w="2291" w:type="pct"/>
             <w:tcMar>
               <w:top w:w="60" w:type="dxa"/>
               <w:left w:w="80" w:type="dxa"/>
@@ -87,24 +94,30 @@
           <w:p>
             <w:pPr>
               <w:spacing w:after="0" w:line="240" w:lineRule="auto"/>
-            </w:pPr>
-          </w:p>
-        </w:tc>
-        <w:tc>
-          <w:tcPr>
-            <w:tcW w:w="1984" w:type="dxa"/>
-            <w:shd w:val="clear" w:color="auto" w:fill="F2F6FA"/>
-            <w:tcMar>
-              <w:top w:w="60" w:type="dxa"/>
-              <w:left w:w="80" w:type="dxa"/>
-              <w:bottom w:w="60" w:type="dxa"/>
-              <w:right w:w="80" w:type="dxa"/>
-            </w:tcMar>
-            <w:vAlign w:val="center"/>
-          </w:tcPr>
-          <w:p>
-            <w:pPr>
-              <w:spacing w:after="0" w:line="240" w:lineRule="auto"/>
+              <w:rPr>
+                <w:rFonts w:ascii="Times New Roman" w:hAnsi="Times New Roman" w:cs="Times New Roman"/>
+                <w:b/>
+                <w:sz w:val="16"/>
+                <w:szCs w:val="16"/>
+              </w:rPr>
+            </w:pPr>
+          </w:p>
+        </w:tc>
+        <w:tc>
+          <w:tcPr>
+            <w:tcW w:w="591" w:type="pct"/>
+            <w:shd w:val="clear" w:color="auto" w:fill="C6D9F1" w:themeFill="text2" w:themeFillTint="33"/>
+            <w:vAlign w:val="center"/>
+          </w:tcPr>
+          <w:p>
+            <w:pPr>
+              <w:spacing w:after="0" w:line="240" w:lineRule="auto"/>
+              <w:rPr>
+                <w:rFonts w:ascii="Times New Roman" w:hAnsi="Times New Roman" w:cs="Times New Roman"/>
+                <w:b/>
+                <w:sz w:val="16"/>
+                <w:szCs w:val="16"/>
+              </w:rPr>
             </w:pPr>
             <w:proofErr w:type="spellStart"/>
             <w:r>
@@ -120,7 +133,30 @@
         </w:tc>
         <w:tc>
           <w:tcPr>
-            <w:tcW w:w="3026" w:type="dxa"/>
+            <w:tcW w:w="1189" w:type="pct"/>
+            <w:vAlign w:val="center"/>
+          </w:tcPr>
+          <w:p>
+            <w:pPr>
+              <w:spacing w:after="0" w:line="240" w:lineRule="auto"/>
+              <w:rPr>
+                <w:rFonts w:ascii="Segoe UI Symbol" w:hAnsi="Segoe UI Symbol" w:cs="Segoe UI Symbol"/>
+                <w:b/>
+                <w:sz w:val="16"/>
+                <w:szCs w:val="16"/>
+              </w:rPr>
+            </w:pPr>
+          </w:p>
+        </w:tc>
+      </w:tr>
+      <w:tr>
+        <w:trPr>
+          <w:trHeight w:hRule="exact" w:val="224"/>
+        </w:trPr>
+        <w:tc>
+          <w:tcPr>
+            <w:tcW w:w="929" w:type="pct"/>
+            <w:shd w:val="clear" w:color="auto" w:fill="C6D9F1" w:themeFill="text2" w:themeFillTint="33"/>
             <w:tcMar>
               <w:top w:w="60" w:type="dxa"/>
               <w:left w:w="80" w:type="dxa"/>
@@ -132,30 +168,12 @@
           <w:p>
             <w:pPr>
               <w:spacing w:after="0" w:line="240" w:lineRule="auto"/>
-            </w:pPr>
-          </w:p>
-        </w:tc>
-      </w:tr>
-      <w:tr>
-        <w:trPr>
-          <w:trHeight w:hRule="exact" w:val="249"/>
-          <w:jc w:val="center"/>
-        </w:trPr>
-        <w:tc>
-          <w:tcPr>
-            <w:tcW w:w="2495" w:type="dxa"/>
-            <w:shd w:val="clear" w:color="auto" w:fill="F2F6FA"/>
-            <w:tcMar>
-              <w:top w:w="60" w:type="dxa"/>
-              <w:left w:w="80" w:type="dxa"/>
-              <w:bottom w:w="60" w:type="dxa"/>
-              <w:right w:w="80" w:type="dxa"/>
-            </w:tcMar>
-            <w:vAlign w:val="center"/>
-          </w:tcPr>
-          <w:p>
-            <w:pPr>
-              <w:spacing w:after="0" w:line="240" w:lineRule="auto"/>
+              <w:rPr>
+                <w:rFonts w:ascii="Times New Roman" w:hAnsi="Times New Roman" w:cs="Times New Roman"/>
+                <w:b/>
+                <w:sz w:val="16"/>
+                <w:szCs w:val="16"/>
+              </w:rPr>
             </w:pPr>
             <w:proofErr w:type="spellStart"/>
             <w:r>
@@ -189,7 +207,7 @@
         </w:tc>
         <w:tc>
           <w:tcPr>
-            <w:tcW w:w="5420" w:type="dxa"/>
+            <w:tcW w:w="2291" w:type="pct"/>
             <w:tcMar>
               <w:top w:w="60" w:type="dxa"/>
               <w:left w:w="80" w:type="dxa"/>
@@ -201,24 +219,30 @@
           <w:p>
             <w:pPr>
               <w:spacing w:after="0" w:line="240" w:lineRule="auto"/>
-            </w:pPr>
-          </w:p>
-        </w:tc>
-        <w:tc>
-          <w:tcPr>
-            <w:tcW w:w="1984" w:type="dxa"/>
-            <w:shd w:val="clear" w:color="auto" w:fill="F2F6FA"/>
-            <w:tcMar>
-              <w:top w:w="60" w:type="dxa"/>
-              <w:left w:w="80" w:type="dxa"/>
-              <w:bottom w:w="60" w:type="dxa"/>
-              <w:right w:w="80" w:type="dxa"/>
-            </w:tcMar>
-            <w:vAlign w:val="center"/>
-          </w:tcPr>
-          <w:p>
-            <w:pPr>
-              <w:spacing w:after="0" w:line="240" w:lineRule="auto"/>
+              <w:rPr>
+                <w:rFonts w:ascii="Times New Roman" w:hAnsi="Times New Roman" w:cs="Times New Roman"/>
+                <w:b/>
+                <w:sz w:val="16"/>
+                <w:szCs w:val="16"/>
+              </w:rPr>
+            </w:pPr>
+          </w:p>
+        </w:tc>
+        <w:tc>
+          <w:tcPr>
+            <w:tcW w:w="591" w:type="pct"/>
+            <w:shd w:val="clear" w:color="auto" w:fill="C6D9F1" w:themeFill="text2" w:themeFillTint="33"/>
+            <w:vAlign w:val="center"/>
+          </w:tcPr>
+          <w:p>
+            <w:pPr>
+              <w:spacing w:after="0" w:line="240" w:lineRule="auto"/>
+              <w:rPr>
+                <w:rFonts w:ascii="Times New Roman" w:hAnsi="Times New Roman" w:cs="Times New Roman"/>
+                <w:b/>
+                <w:sz w:val="16"/>
+                <w:szCs w:val="16"/>
+              </w:rPr>
             </w:pPr>
             <w:proofErr w:type="spellStart"/>
             <w:r>
@@ -270,7 +294,30 @@
         </w:tc>
         <w:tc>
           <w:tcPr>
-            <w:tcW w:w="3026" w:type="dxa"/>
+            <w:tcW w:w="1189" w:type="pct"/>
+            <w:vAlign w:val="center"/>
+          </w:tcPr>
+          <w:p>
+            <w:pPr>
+              <w:spacing w:after="0" w:line="240" w:lineRule="auto"/>
+              <w:rPr>
+                <w:rFonts w:ascii="Segoe UI Symbol" w:hAnsi="Segoe UI Symbol" w:cs="Segoe UI Symbol"/>
+                <w:b/>
+                <w:sz w:val="16"/>
+                <w:szCs w:val="16"/>
+              </w:rPr>
+            </w:pPr>
+          </w:p>
+        </w:tc>
+      </w:tr>
+      <w:tr>
+        <w:trPr>
+          <w:trHeight w:hRule="exact" w:val="224"/>
+        </w:trPr>
+        <w:tc>
+          <w:tcPr>
+            <w:tcW w:w="929" w:type="pct"/>
+            <w:shd w:val="clear" w:color="auto" w:fill="C6D9F1" w:themeFill="text2" w:themeFillTint="33"/>
             <w:tcMar>
               <w:top w:w="60" w:type="dxa"/>
               <w:left w:w="80" w:type="dxa"/>
@@ -282,474 +329,12 @@
           <w:p>
             <w:pPr>
               <w:spacing w:after="0" w:line="240" w:lineRule="auto"/>
-            </w:pPr>
-          </w:p>
-        </w:tc>
-      </w:tr>
-      <w:tr>
-        <w:trPr>
-          <w:trHeight w:hRule="exact" w:val="249"/>
-          <w:jc w:val="center"/>
-        </w:trPr>
-        <w:tc>
-          <w:tcPr>
-            <w:tcW w:w="2495" w:type="dxa"/>
-            <w:shd w:val="clear" w:color="auto" w:fill="F2F6FA"/>
-            <w:tcMar>
-              <w:top w:w="60" w:type="dxa"/>
-              <w:left w:w="80" w:type="dxa"/>
-              <w:bottom w:w="60" w:type="dxa"/>
-              <w:right w:w="80" w:type="dxa"/>
-            </w:tcMar>
-            <w:vAlign w:val="center"/>
-          </w:tcPr>
-          <w:p>
-            <w:pPr>
-              <w:spacing w:after="0" w:line="240" w:lineRule="auto"/>
-            </w:pPr>
-            <w:r>
               <w:rPr>
+                <w:rFonts w:ascii="Times New Roman" w:hAnsi="Times New Roman" w:cs="Times New Roman"/>
                 <w:b/>
-                <w:color w:val="000000"/>
                 <w:sz w:val="16"/>
+                <w:szCs w:val="16"/>
               </w:rPr>
-              <w:t>Ders</w:t>
-            </w:r>
-          </w:p>
-        </w:tc>
-        <w:tc>
-          <w:tcPr>
-            <w:tcW w:w="5420" w:type="dxa"/>
-            <w:tcMar>
-              <w:top w:w="60" w:type="dxa"/>
-              <w:left w:w="80" w:type="dxa"/>
-              <w:bottom w:w="60" w:type="dxa"/>
-              <w:right w:w="80" w:type="dxa"/>
-            </w:tcMar>
-            <w:vAlign w:val="center"/>
-          </w:tcPr>
-          <w:p>
-            <w:pPr>
-              <w:spacing w:after="0" w:line="240" w:lineRule="auto"/>
-            </w:pPr>
-          </w:p>
-        </w:tc>
-        <w:tc>
-          <w:tcPr>
-            <w:tcW w:w="1984" w:type="dxa"/>
-            <w:shd w:val="clear" w:color="auto" w:fill="F2F6FA"/>
-            <w:tcMar>
-              <w:top w:w="60" w:type="dxa"/>
-              <w:left w:w="80" w:type="dxa"/>
-              <w:bottom w:w="60" w:type="dxa"/>
-              <w:right w:w="80" w:type="dxa"/>
-            </w:tcMar>
-            <w:vAlign w:val="center"/>
-          </w:tcPr>
-          <w:p>
-            <w:pPr>
-              <w:spacing w:after="0" w:line="240" w:lineRule="auto"/>
-            </w:pPr>
-            <w:proofErr w:type="spellStart"/>
-            <w:r>
-              <w:rPr>
-                <w:b/>
-                <w:color w:val="000000"/>
-                <w:sz w:val="16"/>
-              </w:rPr>
-              <w:t>Sınıf</w:t>
-            </w:r>
-            <w:proofErr w:type="spellEnd"/>
-            <w:r>
-              <w:rPr>
-                <w:b/>
-                <w:color w:val="000000"/>
-                <w:sz w:val="16"/>
-              </w:rPr>
-              <w:t xml:space="preserve"> / </w:t>
-            </w:r>
-            <w:proofErr w:type="spellStart"/>
-            <w:r>
-              <w:rPr>
-                <w:b/>
-                <w:color w:val="000000"/>
-                <w:sz w:val="16"/>
-              </w:rPr>
-              <w:t>Şube</w:t>
-            </w:r>
-            <w:proofErr w:type="spellEnd"/>
-          </w:p>
-        </w:tc>
-        <w:tc>
-          <w:tcPr>
-            <w:tcW w:w="3026" w:type="dxa"/>
-            <w:tcMar>
-              <w:top w:w="60" w:type="dxa"/>
-              <w:left w:w="80" w:type="dxa"/>
-              <w:bottom w:w="60" w:type="dxa"/>
-              <w:right w:w="80" w:type="dxa"/>
-            </w:tcMar>
-            <w:vAlign w:val="center"/>
-          </w:tcPr>
-          <w:p>
-            <w:pPr>
-              <w:spacing w:after="0" w:line="240" w:lineRule="auto"/>
-            </w:pPr>
-          </w:p>
-        </w:tc>
-      </w:tr>
-      <w:tr>
-        <w:trPr>
-          <w:trHeight w:hRule="exact" w:val="249"/>
-          <w:jc w:val="center"/>
-        </w:trPr>
-        <w:tc>
-          <w:tcPr>
-            <w:tcW w:w="2495" w:type="dxa"/>
-            <w:shd w:val="clear" w:color="auto" w:fill="F2F6FA"/>
-            <w:tcMar>
-              <w:top w:w="60" w:type="dxa"/>
-              <w:left w:w="80" w:type="dxa"/>
-              <w:bottom w:w="60" w:type="dxa"/>
-              <w:right w:w="80" w:type="dxa"/>
-            </w:tcMar>
-            <w:vAlign w:val="center"/>
-          </w:tcPr>
-          <w:p>
-            <w:pPr>
-              <w:spacing w:after="0" w:line="240" w:lineRule="auto"/>
-            </w:pPr>
-            <w:proofErr w:type="spellStart"/>
-            <w:r>
-              <w:rPr>
-                <w:b/>
-                <w:color w:val="000000"/>
-                <w:sz w:val="16"/>
-              </w:rPr>
-              <w:t>Dönem</w:t>
-            </w:r>
-            <w:proofErr w:type="spellEnd"/>
-          </w:p>
-        </w:tc>
-        <w:tc>
-          <w:tcPr>
-            <w:tcW w:w="5420" w:type="dxa"/>
-            <w:tcMar>
-              <w:top w:w="60" w:type="dxa"/>
-              <w:left w:w="80" w:type="dxa"/>
-              <w:bottom w:w="60" w:type="dxa"/>
-              <w:right w:w="80" w:type="dxa"/>
-            </w:tcMar>
-            <w:vAlign w:val="center"/>
-          </w:tcPr>
-          <w:p>
-            <w:pPr>
-              <w:spacing w:after="0" w:line="240" w:lineRule="auto"/>
-            </w:pPr>
-            <w:r>
-              <w:rPr>
-                <w:color w:val="000000"/>
-                <w:sz w:val="16"/>
-              </w:rPr>
-              <w:t xml:space="preserve">☐ 1. </w:t>
-            </w:r>
-            <w:proofErr w:type="spellStart"/>
-            <w:r>
-              <w:rPr>
-                <w:color w:val="000000"/>
-                <w:sz w:val="16"/>
-              </w:rPr>
-              <w:t>Dönem</w:t>
-            </w:r>
-            <w:proofErr w:type="spellEnd"/>
-            <w:r>
-              <w:rPr>
-                <w:color w:val="000000"/>
-                <w:sz w:val="16"/>
-              </w:rPr>
-              <w:t xml:space="preserve">   ☐ 2. </w:t>
-            </w:r>
-            <w:proofErr w:type="spellStart"/>
-            <w:r>
-              <w:rPr>
-                <w:color w:val="000000"/>
-                <w:sz w:val="16"/>
-              </w:rPr>
-              <w:t>Dönem</w:t>
-            </w:r>
-            <w:proofErr w:type="spellEnd"/>
-          </w:p>
-        </w:tc>
-        <w:tc>
-          <w:tcPr>
-            <w:tcW w:w="1984" w:type="dxa"/>
-            <w:shd w:val="clear" w:color="auto" w:fill="F2F6FA"/>
-            <w:tcMar>
-              <w:top w:w="60" w:type="dxa"/>
-              <w:left w:w="80" w:type="dxa"/>
-              <w:bottom w:w="60" w:type="dxa"/>
-              <w:right w:w="80" w:type="dxa"/>
-            </w:tcMar>
-            <w:vAlign w:val="center"/>
-          </w:tcPr>
-          <w:p>
-            <w:pPr>
-              <w:spacing w:after="0" w:line="240" w:lineRule="auto"/>
-            </w:pPr>
-            <w:proofErr w:type="spellStart"/>
-            <w:r>
-              <w:rPr>
-                <w:b/>
-                <w:color w:val="000000"/>
-                <w:sz w:val="16"/>
-              </w:rPr>
-              <w:t>Sınav</w:t>
-            </w:r>
-            <w:proofErr w:type="spellEnd"/>
-            <w:r>
-              <w:rPr>
-                <w:b/>
-                <w:color w:val="000000"/>
-                <w:sz w:val="16"/>
-              </w:rPr>
-              <w:t xml:space="preserve"> </w:t>
-            </w:r>
-            <w:proofErr w:type="spellStart"/>
-            <w:r>
-              <w:rPr>
-                <w:b/>
-                <w:color w:val="000000"/>
-                <w:sz w:val="16"/>
-              </w:rPr>
-              <w:t>Türü</w:t>
-            </w:r>
-            <w:proofErr w:type="spellEnd"/>
-          </w:p>
-        </w:tc>
-        <w:tc>
-          <w:tcPr>
-            <w:tcW w:w="3026" w:type="dxa"/>
-            <w:tcMar>
-              <w:top w:w="60" w:type="dxa"/>
-              <w:left w:w="80" w:type="dxa"/>
-              <w:bottom w:w="60" w:type="dxa"/>
-              <w:right w:w="80" w:type="dxa"/>
-            </w:tcMar>
-            <w:vAlign w:val="center"/>
-          </w:tcPr>
-          <w:p>
-            <w:pPr>
-              <w:spacing w:after="0" w:line="240" w:lineRule="auto"/>
-            </w:pPr>
-            <w:r>
-              <w:rPr>
-                <w:color w:val="000000"/>
-                <w:sz w:val="16"/>
-              </w:rPr>
-              <w:t xml:space="preserve">☐ 1. </w:t>
-            </w:r>
-            <w:proofErr w:type="spellStart"/>
-            <w:proofErr w:type="gramStart"/>
-            <w:r>
-              <w:rPr>
-                <w:color w:val="000000"/>
-                <w:sz w:val="16"/>
-              </w:rPr>
-              <w:t>Yazılı</w:t>
-            </w:r>
-            <w:proofErr w:type="spellEnd"/>
-            <w:r>
-              <w:rPr>
-                <w:color w:val="000000"/>
-                <w:sz w:val="16"/>
-              </w:rPr>
-              <w:t xml:space="preserve">  ☐</w:t>
-            </w:r>
-            <w:proofErr w:type="gramEnd"/>
-            <w:r>
-              <w:rPr>
-                <w:color w:val="000000"/>
-                <w:sz w:val="16"/>
-              </w:rPr>
-              <w:t xml:space="preserve"> 2. </w:t>
-            </w:r>
-            <w:proofErr w:type="spellStart"/>
-            <w:r>
-              <w:rPr>
-                <w:color w:val="000000"/>
-                <w:sz w:val="16"/>
-              </w:rPr>
-              <w:t>Yazılı</w:t>
-            </w:r>
-            <w:proofErr w:type="spellEnd"/>
-            <w:r>
-              <w:rPr>
-                <w:color w:val="000000"/>
-                <w:sz w:val="16"/>
-              </w:rPr>
-              <w:t xml:space="preserve">  ☐ </w:t>
-            </w:r>
-            <w:proofErr w:type="spellStart"/>
-            <w:r>
-              <w:rPr>
-                <w:color w:val="000000"/>
-                <w:sz w:val="16"/>
-              </w:rPr>
-              <w:t>Diğer</w:t>
-            </w:r>
-            <w:proofErr w:type="spellEnd"/>
-            <w:r>
-              <w:rPr>
-                <w:color w:val="000000"/>
-                <w:sz w:val="16"/>
-              </w:rPr>
-              <w:t>:</w:t>
-            </w:r>
-          </w:p>
-        </w:tc>
-      </w:tr>
-      <w:tr>
-        <w:trPr>
-          <w:trHeight w:hRule="exact" w:val="249"/>
-          <w:jc w:val="center"/>
-        </w:trPr>
-        <w:tc>
-          <w:tcPr>
-            <w:tcW w:w="2495" w:type="dxa"/>
-            <w:shd w:val="clear" w:color="auto" w:fill="F2F6FA"/>
-            <w:tcMar>
-              <w:top w:w="60" w:type="dxa"/>
-              <w:left w:w="80" w:type="dxa"/>
-              <w:bottom w:w="60" w:type="dxa"/>
-              <w:right w:w="80" w:type="dxa"/>
-            </w:tcMar>
-            <w:vAlign w:val="center"/>
-          </w:tcPr>
-          <w:p>
-            <w:pPr>
-              <w:spacing w:after="0" w:line="240" w:lineRule="auto"/>
-            </w:pPr>
-            <w:proofErr w:type="spellStart"/>
-            <w:r>
-              <w:rPr>
-                <w:b/>
-                <w:color w:val="000000"/>
-                <w:sz w:val="16"/>
-              </w:rPr>
-              <w:t>Sınav</w:t>
-            </w:r>
-            <w:proofErr w:type="spellEnd"/>
-            <w:r>
-              <w:rPr>
-                <w:b/>
-                <w:color w:val="000000"/>
-                <w:sz w:val="16"/>
-              </w:rPr>
-              <w:t xml:space="preserve"> </w:t>
-            </w:r>
-            <w:proofErr w:type="spellStart"/>
-            <w:r>
-              <w:rPr>
-                <w:b/>
-                <w:color w:val="000000"/>
-                <w:sz w:val="16"/>
-              </w:rPr>
-              <w:t>Tarihi</w:t>
-            </w:r>
-            <w:proofErr w:type="spellEnd"/>
-          </w:p>
-        </w:tc>
-        <w:tc>
-          <w:tcPr>
-            <w:tcW w:w="5420" w:type="dxa"/>
-            <w:tcMar>
-              <w:top w:w="60" w:type="dxa"/>
-              <w:left w:w="80" w:type="dxa"/>
-              <w:bottom w:w="60" w:type="dxa"/>
-              <w:right w:w="80" w:type="dxa"/>
-            </w:tcMar>
-            <w:vAlign w:val="center"/>
-          </w:tcPr>
-          <w:p>
-            <w:pPr>
-              <w:spacing w:after="0" w:line="240" w:lineRule="auto"/>
-            </w:pPr>
-          </w:p>
-        </w:tc>
-        <w:tc>
-          <w:tcPr>
-            <w:tcW w:w="1984" w:type="dxa"/>
-            <w:shd w:val="clear" w:color="auto" w:fill="F2F6FA"/>
-            <w:tcMar>
-              <w:top w:w="60" w:type="dxa"/>
-              <w:left w:w="80" w:type="dxa"/>
-              <w:bottom w:w="60" w:type="dxa"/>
-              <w:right w:w="80" w:type="dxa"/>
-            </w:tcMar>
-            <w:vAlign w:val="center"/>
-          </w:tcPr>
-          <w:p>
-            <w:pPr>
-              <w:spacing w:after="0" w:line="240" w:lineRule="auto"/>
-            </w:pPr>
-            <w:proofErr w:type="spellStart"/>
-            <w:r>
-              <w:rPr>
-                <w:b/>
-                <w:color w:val="000000"/>
-                <w:sz w:val="16"/>
-              </w:rPr>
-              <w:t>Toplam</w:t>
-            </w:r>
-            <w:proofErr w:type="spellEnd"/>
-            <w:r>
-              <w:rPr>
-                <w:b/>
-                <w:color w:val="000000"/>
-                <w:sz w:val="16"/>
-              </w:rPr>
-              <w:t xml:space="preserve"> Puan</w:t>
-            </w:r>
-          </w:p>
-        </w:tc>
-        <w:tc>
-          <w:tcPr>
-            <w:tcW w:w="3026" w:type="dxa"/>
-            <w:tcMar>
-              <w:top w:w="60" w:type="dxa"/>
-              <w:left w:w="80" w:type="dxa"/>
-              <w:bottom w:w="60" w:type="dxa"/>
-              <w:right w:w="80" w:type="dxa"/>
-            </w:tcMar>
-            <w:vAlign w:val="center"/>
-          </w:tcPr>
-          <w:p>
-            <w:pPr>
-              <w:spacing w:after="0" w:line="240" w:lineRule="auto"/>
-            </w:pPr>
-          </w:p>
-        </w:tc>
-      </w:tr>
-      <w:tr>
-        <w:trPr>
-          <w:trHeight w:hRule="exact" w:val="249"/>
-          <w:jc w:val="center"/>
-        </w:trPr>
-        <w:tc>
-          <w:tcPr>
-            <w:tcW w:w="2495" w:type="dxa"/>
-            <w:shd w:val="clear" w:color="auto" w:fill="F2F6FA"/>
-            <w:tcMar>
-              <w:top w:w="60" w:type="dxa"/>
-              <w:left w:w="80" w:type="dxa"/>
-              <w:bottom w:w="60" w:type="dxa"/>
-              <w:right w:w="80" w:type="dxa"/>
-            </w:tcMar>
-            <w:vAlign w:val="center"/>
-          </w:tcPr>
-          <w:p>
-            <w:pPr>
-              <w:spacing w:after="0" w:line="240" w:lineRule="auto"/>
             </w:pPr>
             <w:proofErr w:type="spellStart"/>
             <w:r>
@@ -801,7 +386,7 @@
         </w:tc>
         <w:tc>
           <w:tcPr>
-            <w:tcW w:w="5420" w:type="dxa"/>
+            <w:tcW w:w="2291" w:type="pct"/>
             <w:tcMar>
               <w:top w:w="60" w:type="dxa"/>
               <w:left w:w="80" w:type="dxa"/>
@@ -813,13 +398,197 @@
           <w:p>
             <w:pPr>
               <w:spacing w:after="0" w:line="240" w:lineRule="auto"/>
-            </w:pPr>
-          </w:p>
-        </w:tc>
-        <w:tc>
-          <w:tcPr>
-            <w:tcW w:w="1984" w:type="dxa"/>
-            <w:shd w:val="clear" w:color="auto" w:fill="F2F6FA"/>
+              <w:rPr>
+                <w:rFonts w:ascii="Times New Roman" w:hAnsi="Times New Roman" w:cs="Times New Roman"/>
+                <w:b/>
+                <w:sz w:val="16"/>
+                <w:szCs w:val="16"/>
+              </w:rPr>
+            </w:pPr>
+          </w:p>
+        </w:tc>
+        <w:tc>
+          <w:tcPr>
+            <w:tcW w:w="591" w:type="pct"/>
+            <w:shd w:val="clear" w:color="auto" w:fill="C6D9F1" w:themeFill="text2" w:themeFillTint="33"/>
+            <w:vAlign w:val="center"/>
+          </w:tcPr>
+          <w:p>
+            <w:pPr>
+              <w:spacing w:after="0" w:line="240" w:lineRule="auto"/>
+              <w:rPr>
+                <w:rFonts w:ascii="Times New Roman" w:hAnsi="Times New Roman" w:cs="Times New Roman"/>
+                <w:b/>
+                <w:sz w:val="16"/>
+                <w:szCs w:val="16"/>
+              </w:rPr>
+            </w:pPr>
+            <w:proofErr w:type="spellStart"/>
+            <w:r>
+              <w:rPr>
+                <w:rFonts w:ascii="Times New Roman" w:hAnsi="Times New Roman" w:cs="Times New Roman"/>
+                <w:b/>
+                <w:sz w:val="16"/>
+                <w:szCs w:val="16"/>
+              </w:rPr>
+              <w:t>Sınav</w:t>
+            </w:r>
+            <w:proofErr w:type="spellEnd"/>
+            <w:r>
+              <w:rPr>
+                <w:rFonts w:ascii="Times New Roman" w:hAnsi="Times New Roman" w:cs="Times New Roman"/>
+                <w:b/>
+                <w:sz w:val="16"/>
+                <w:szCs w:val="16"/>
+              </w:rPr>
+              <w:t xml:space="preserve"> </w:t>
+            </w:r>
+            <w:proofErr w:type="spellStart"/>
+            <w:r>
+              <w:rPr>
+                <w:rFonts w:ascii="Times New Roman" w:hAnsi="Times New Roman" w:cs="Times New Roman"/>
+                <w:b/>
+                <w:sz w:val="16"/>
+                <w:szCs w:val="16"/>
+              </w:rPr>
+              <w:t>Türü</w:t>
+            </w:r>
+            <w:proofErr w:type="spellEnd"/>
+          </w:p>
+        </w:tc>
+        <w:tc>
+          <w:tcPr>
+            <w:tcW w:w="1189" w:type="pct"/>
+            <w:vAlign w:val="center"/>
+          </w:tcPr>
+          <w:p>
+            <w:pPr>
+              <w:spacing w:after="0" w:line="240" w:lineRule="auto"/>
+              <w:rPr>
+                <w:rFonts w:ascii="Times New Roman" w:hAnsi="Times New Roman" w:cs="Times New Roman"/>
+                <w:b/>
+                <w:sz w:val="16"/>
+                <w:szCs w:val="16"/>
+              </w:rPr>
+            </w:pPr>
+            <w:r>
+              <w:rPr>
+                <w:rFonts w:ascii="Segoe UI Symbol" w:hAnsi="Segoe UI Symbol" w:cs="Segoe UI Symbol"/>
+                <w:b/>
+                <w:sz w:val="16"/>
+                <w:szCs w:val="16"/>
+              </w:rPr>
+              <w:t>☐</w:t>
+            </w:r>
+            <w:r>
+              <w:rPr>
+                <w:rFonts w:ascii="Times New Roman" w:hAnsi="Times New Roman" w:cs="Times New Roman"/>
+                <w:b/>
+                <w:sz w:val="16"/>
+                <w:szCs w:val="16"/>
+              </w:rPr>
+              <w:t xml:space="preserve"> </w:t>
+            </w:r>
+            <w:proofErr w:type="spellStart"/>
+            <w:proofErr w:type="gramStart"/>
+            <w:r>
+              <w:rPr>
+                <w:rFonts w:ascii="Times New Roman" w:hAnsi="Times New Roman" w:cs="Times New Roman"/>
+                <w:b/>
+                <w:sz w:val="16"/>
+                <w:szCs w:val="16"/>
+              </w:rPr>
+              <w:t>Yazılı</w:t>
+            </w:r>
+            <w:proofErr w:type="spellEnd"/>
+            <w:r>
+              <w:rPr>
+                <w:rFonts w:ascii="Times New Roman" w:hAnsi="Times New Roman" w:cs="Times New Roman"/>
+                <w:b/>
+                <w:sz w:val="16"/>
+                <w:szCs w:val="16"/>
+              </w:rPr>
+              <w:t xml:space="preserve">  </w:t>
+            </w:r>
+            <w:r>
+              <w:rPr>
+                <w:rFonts w:ascii="Segoe UI Symbol" w:hAnsi="Segoe UI Symbol" w:cs="Segoe UI Symbol"/>
+                <w:b/>
+                <w:sz w:val="16"/>
+                <w:szCs w:val="16"/>
+              </w:rPr>
+              <w:t>☐</w:t>
+            </w:r>
+            <w:proofErr w:type="gramEnd"/>
+            <w:r>
+              <w:rPr>
+                <w:rFonts w:ascii="Times New Roman" w:hAnsi="Times New Roman" w:cs="Times New Roman"/>
+                <w:b/>
+                <w:sz w:val="16"/>
+                <w:szCs w:val="16"/>
+              </w:rPr>
+              <w:t xml:space="preserve"> 2. </w:t>
+            </w:r>
+            <w:proofErr w:type="spellStart"/>
+            <w:r>
+              <w:rPr>
+                <w:rFonts w:ascii="Times New Roman" w:hAnsi="Times New Roman" w:cs="Times New Roman"/>
+                <w:b/>
+                <w:sz w:val="16"/>
+                <w:szCs w:val="16"/>
+              </w:rPr>
+              <w:t>Dinleme</w:t>
+            </w:r>
+            <w:proofErr w:type="spellEnd"/>
+            <w:r>
+              <w:rPr>
+                <w:rFonts w:ascii="Times New Roman" w:hAnsi="Times New Roman" w:cs="Times New Roman"/>
+                <w:b/>
+                <w:sz w:val="16"/>
+                <w:szCs w:val="16"/>
+              </w:rPr>
+              <w:t xml:space="preserve"> </w:t>
+            </w:r>
+            <w:r>
+              <w:rPr>
+                <w:rFonts w:ascii="Segoe UI Symbol" w:hAnsi="Segoe UI Symbol" w:cs="Segoe UI Symbol"/>
+                <w:b/>
+                <w:sz w:val="16"/>
+                <w:szCs w:val="16"/>
+              </w:rPr>
+              <w:t>☐</w:t>
+            </w:r>
+            <w:r>
+              <w:rPr>
+                <w:rFonts w:ascii="Times New Roman" w:hAnsi="Times New Roman" w:cs="Times New Roman"/>
+                <w:b/>
+                <w:sz w:val="16"/>
+                <w:szCs w:val="16"/>
+              </w:rPr>
+              <w:t xml:space="preserve"> </w:t>
+            </w:r>
+            <w:proofErr w:type="spellStart"/>
+            <w:r>
+              <w:rPr>
+                <w:rFonts w:ascii="Times New Roman" w:hAnsi="Times New Roman" w:cs="Times New Roman"/>
+                <w:b/>
+                <w:sz w:val="16"/>
+                <w:szCs w:val="16"/>
+              </w:rPr>
+              <w:t>Konuşma</w:t>
+            </w:r>
+            <w:proofErr w:type="spellEnd"/>
+          </w:p>
+        </w:tc>
+      </w:tr>
+      <w:tr>
+        <w:trPr>
+          <w:trHeight w:hRule="exact" w:val="224"/>
+        </w:trPr>
+        <w:tc>
+          <w:tcPr>
+            <w:tcW w:w="929" w:type="pct"/>
+            <w:shd w:val="clear" w:color="auto" w:fill="C6D9F1" w:themeFill="text2" w:themeFillTint="33"/>
             <w:tcMar>
               <w:top w:w="60" w:type="dxa"/>
               <w:left w:w="80" w:type="dxa"/>
@@ -831,6 +600,12 @@
           <w:p>
             <w:pPr>
               <w:spacing w:after="0" w:line="240" w:lineRule="auto"/>
+              <w:rPr>
+                <w:rFonts w:ascii="Times New Roman" w:hAnsi="Times New Roman" w:cs="Times New Roman"/>
+                <w:b/>
+                <w:sz w:val="16"/>
+                <w:szCs w:val="16"/>
+              </w:rPr>
             </w:pPr>
             <w:r>
               <w:rPr>
@@ -862,7 +637,7 @@
         </w:tc>
         <w:tc>
           <w:tcPr>
-            <w:tcW w:w="3026" w:type="dxa"/>
+            <w:tcW w:w="2291" w:type="pct"/>
             <w:tcMar>
               <w:top w:w="60" w:type="dxa"/>
               <w:left w:w="80" w:type="dxa"/>
@@ -874,6 +649,12 @@
           <w:p>
             <w:pPr>
               <w:spacing w:after="0" w:line="240" w:lineRule="auto"/>
+              <w:rPr>
+                <w:rFonts w:ascii="Times New Roman" w:hAnsi="Times New Roman" w:cs="Times New Roman"/>
+                <w:b/>
+                <w:sz w:val="16"/>
+                <w:szCs w:val="16"/>
+              </w:rPr>
             </w:pPr>
             <w:r>
               <w:rPr>
@@ -881,6 +662,470 @@
                 <w:sz w:val="16"/>
               </w:rPr>
               <w:t>____ / ____</w:t>
+            </w:r>
+          </w:p>
+        </w:tc>
+        <w:tc>
+          <w:tcPr>
+            <w:tcW w:w="591" w:type="pct"/>
+            <w:shd w:val="clear" w:color="auto" w:fill="C6D9F1" w:themeFill="text2" w:themeFillTint="33"/>
+            <w:vAlign w:val="center"/>
+          </w:tcPr>
+          <w:p>
+            <w:pPr>
+              <w:spacing w:after="0" w:line="240" w:lineRule="auto"/>
+              <w:rPr>
+                <w:rFonts w:ascii="Times New Roman" w:hAnsi="Times New Roman" w:cs="Times New Roman"/>
+                <w:b/>
+                <w:sz w:val="16"/>
+                <w:szCs w:val="16"/>
+              </w:rPr>
+            </w:pPr>
+            <w:proofErr w:type="spellStart"/>
+            <w:r>
+              <w:rPr>
+                <w:rFonts w:ascii="Times New Roman" w:hAnsi="Times New Roman" w:cs="Times New Roman"/>
+                <w:b/>
+                <w:sz w:val="16"/>
+                <w:szCs w:val="16"/>
+              </w:rPr>
+              <w:t>Sınav</w:t>
+            </w:r>
+            <w:proofErr w:type="spellEnd"/>
+            <w:r>
+              <w:rPr>
+                <w:rFonts w:ascii="Times New Roman" w:hAnsi="Times New Roman" w:cs="Times New Roman"/>
+                <w:b/>
+                <w:sz w:val="16"/>
+                <w:szCs w:val="16"/>
+              </w:rPr>
+              <w:t xml:space="preserve"> </w:t>
+            </w:r>
+            <w:proofErr w:type="spellStart"/>
+            <w:r>
+              <w:rPr>
+                <w:rFonts w:ascii="Times New Roman" w:hAnsi="Times New Roman" w:cs="Times New Roman"/>
+                <w:b/>
+                <w:sz w:val="16"/>
+                <w:szCs w:val="16"/>
+              </w:rPr>
+              <w:t>Tarihi</w:t>
+            </w:r>
+            <w:proofErr w:type="spellEnd"/>
+          </w:p>
+        </w:tc>
+        <w:tc>
+          <w:tcPr>
+            <w:tcW w:w="1189" w:type="pct"/>
+            <w:vAlign w:val="center"/>
+          </w:tcPr>
+          <w:p>
+            <w:pPr>
+              <w:spacing w:after="0" w:line="240" w:lineRule="auto"/>
+              <w:rPr>
+                <w:rFonts w:ascii="Times New Roman" w:hAnsi="Times New Roman" w:cs="Times New Roman"/>
+                <w:b/>
+                <w:sz w:val="16"/>
+                <w:szCs w:val="16"/>
+              </w:rPr>
+            </w:pPr>
+            <w:r>
+              <w:rPr>
+                <w:rFonts w:ascii="Times New Roman" w:hAnsi="Times New Roman" w:cs="Times New Roman"/>
+                <w:b/>
+                <w:sz w:val="16"/>
+                <w:szCs w:val="16"/>
+              </w:rPr>
+              <w:t>.... / .... / 20....</w:t>
+            </w:r>
+          </w:p>
+        </w:tc>
+      </w:tr>
+      <w:tr>
+        <w:trPr>
+          <w:trHeight w:hRule="exact" w:val="224"/>
+        </w:trPr>
+        <w:tc>
+          <w:tcPr>
+            <w:tcW w:w="929" w:type="pct"/>
+            <w:shd w:val="clear" w:color="auto" w:fill="C6D9F1" w:themeFill="text2" w:themeFillTint="33"/>
+            <w:tcMar>
+              <w:top w:w="60" w:type="dxa"/>
+              <w:left w:w="80" w:type="dxa"/>
+              <w:bottom w:w="60" w:type="dxa"/>
+              <w:right w:w="80" w:type="dxa"/>
+            </w:tcMar>
+            <w:vAlign w:val="center"/>
+          </w:tcPr>
+          <w:p>
+            <w:pPr>
+              <w:spacing w:after="0" w:line="240" w:lineRule="auto"/>
+              <w:rPr>
+                <w:rFonts w:ascii="Times New Roman" w:hAnsi="Times New Roman" w:cs="Times New Roman"/>
+                <w:b/>
+                <w:sz w:val="16"/>
+                <w:szCs w:val="16"/>
+              </w:rPr>
+            </w:pPr>
+            <w:proofErr w:type="spellStart"/>
+            <w:r>
+              <w:rPr>
+                <w:rFonts w:ascii="Times New Roman" w:hAnsi="Times New Roman" w:cs="Times New Roman"/>
+                <w:b/>
+                <w:sz w:val="16"/>
+                <w:szCs w:val="16"/>
+              </w:rPr>
+              <w:t>Sınıf</w:t>
+            </w:r>
+            <w:proofErr w:type="spellEnd"/>
+            <w:r>
+              <w:rPr>
+                <w:rFonts w:ascii="Times New Roman" w:hAnsi="Times New Roman" w:cs="Times New Roman"/>
+                <w:b/>
+                <w:sz w:val="16"/>
+                <w:szCs w:val="16"/>
+              </w:rPr>
+              <w:t>/</w:t>
+            </w:r>
+            <w:proofErr w:type="spellStart"/>
+            <w:r>
+              <w:rPr>
+                <w:rFonts w:ascii="Times New Roman" w:hAnsi="Times New Roman" w:cs="Times New Roman"/>
+                <w:b/>
+                <w:sz w:val="16"/>
+                <w:szCs w:val="16"/>
+              </w:rPr>
+              <w:t>Şube</w:t>
+            </w:r>
+            <w:proofErr w:type="spellEnd"/>
+          </w:p>
+        </w:tc>
+        <w:tc>
+          <w:tcPr>
+            <w:tcW w:w="2291" w:type="pct"/>
+            <w:tcMar>
+              <w:top w:w="60" w:type="dxa"/>
+              <w:left w:w="80" w:type="dxa"/>
+              <w:bottom w:w="60" w:type="dxa"/>
+              <w:right w:w="80" w:type="dxa"/>
+            </w:tcMar>
+            <w:vAlign w:val="center"/>
+          </w:tcPr>
+          <w:p>
+            <w:pPr>
+              <w:spacing w:after="0" w:line="240" w:lineRule="auto"/>
+              <w:rPr>
+                <w:rFonts w:ascii="Times New Roman" w:hAnsi="Times New Roman" w:cs="Times New Roman"/>
+                <w:b/>
+                <w:sz w:val="16"/>
+                <w:szCs w:val="16"/>
+              </w:rPr>
+            </w:pPr>
+          </w:p>
+        </w:tc>
+        <w:tc>
+          <w:tcPr>
+            <w:tcW w:w="1780" w:type="pct"/>
+            <w:gridSpan w:val="2"/>
+            <w:vAlign w:val="center"/>
+          </w:tcPr>
+          <w:p>
+            <w:pPr>
+              <w:spacing w:after="0" w:line="240" w:lineRule="auto"/>
+              <w:jc w:val="center"/>
+              <w:rPr>
+                <w:rFonts w:ascii="Times New Roman" w:hAnsi="Times New Roman" w:cs="Times New Roman"/>
+                <w:b/>
+                <w:sz w:val="16"/>
+                <w:szCs w:val="16"/>
+              </w:rPr>
+            </w:pPr>
+            <w:r>
+              <w:rPr>
+                <w:rFonts w:ascii="Segoe UI Symbol" w:hAnsi="Segoe UI Symbol" w:cs="Segoe UI Symbol"/>
+                <w:b/>
+                <w:sz w:val="16"/>
+                <w:szCs w:val="16"/>
+              </w:rPr>
+              <w:t>☐</w:t>
+            </w:r>
+            <w:r>
+              <w:rPr>
+                <w:rFonts w:ascii="Times New Roman" w:hAnsi="Times New Roman" w:cs="Times New Roman"/>
+                <w:b/>
+                <w:sz w:val="16"/>
+                <w:szCs w:val="16"/>
+              </w:rPr>
+              <w:t xml:space="preserve"> 1. </w:t>
+            </w:r>
+            <w:proofErr w:type="spellStart"/>
+            <w:r>
+              <w:rPr>
+                <w:rFonts w:ascii="Times New Roman" w:hAnsi="Times New Roman" w:cs="Times New Roman"/>
+                <w:b/>
+                <w:sz w:val="16"/>
+                <w:szCs w:val="16"/>
+              </w:rPr>
+              <w:t>Dönem</w:t>
+            </w:r>
+            <w:proofErr w:type="spellEnd"/>
+            <w:r>
+              <w:rPr>
+                <w:rFonts w:ascii="Times New Roman" w:hAnsi="Times New Roman" w:cs="Times New Roman"/>
+                <w:b/>
+                <w:sz w:val="16"/>
+                <w:szCs w:val="16"/>
+              </w:rPr>
+              <w:t xml:space="preserve">   </w:t>
+            </w:r>
+            <w:r>
+              <w:rPr>
+                <w:rFonts w:ascii="Segoe UI Symbol" w:hAnsi="Segoe UI Symbol" w:cs="Segoe UI Symbol"/>
+                <w:b/>
+                <w:sz w:val="16"/>
+                <w:szCs w:val="16"/>
+              </w:rPr>
+              <w:t>☐</w:t>
+            </w:r>
+            <w:r>
+              <w:rPr>
+                <w:rFonts w:ascii="Times New Roman" w:hAnsi="Times New Roman" w:cs="Times New Roman"/>
+                <w:b/>
+                <w:sz w:val="16"/>
+                <w:szCs w:val="16"/>
+              </w:rPr>
+              <w:t xml:space="preserve"> 2. </w:t>
+            </w:r>
+            <w:proofErr w:type="spellStart"/>
+            <w:r>
+              <w:rPr>
+                <w:rFonts w:ascii="Times New Roman" w:hAnsi="Times New Roman" w:cs="Times New Roman"/>
+                <w:b/>
+                <w:sz w:val="16"/>
+                <w:szCs w:val="16"/>
+              </w:rPr>
+              <w:t>Dönem</w:t>
+            </w:r>
+            <w:proofErr w:type="spellEnd"/>
+          </w:p>
+        </w:tc>
+      </w:tr>
+      <w:tr>
+        <w:trPr>
+          <w:trHeight w:hRule="exact" w:val="224"/>
+        </w:trPr>
+        <w:tc>
+          <w:tcPr>
+            <w:tcW w:w="929" w:type="pct"/>
+            <w:shd w:val="clear" w:color="auto" w:fill="C6D9F1" w:themeFill="text2" w:themeFillTint="33"/>
+            <w:tcMar>
+              <w:top w:w="60" w:type="dxa"/>
+              <w:left w:w="80" w:type="dxa"/>
+              <w:bottom w:w="60" w:type="dxa"/>
+              <w:right w:w="80" w:type="dxa"/>
+            </w:tcMar>
+            <w:vAlign w:val="center"/>
+          </w:tcPr>
+          <w:p>
+            <w:pPr>
+              <w:spacing w:after="0" w:line="240" w:lineRule="auto"/>
+              <w:rPr>
+                <w:rFonts w:ascii="Times New Roman" w:hAnsi="Times New Roman" w:cs="Times New Roman"/>
+                <w:b/>
+                <w:sz w:val="16"/>
+                <w:szCs w:val="16"/>
+              </w:rPr>
+            </w:pPr>
+            <w:proofErr w:type="spellStart"/>
+            <w:r>
+              <w:rPr>
+                <w:rFonts w:ascii="Times New Roman" w:hAnsi="Times New Roman" w:cs="Times New Roman"/>
+                <w:b/>
+                <w:sz w:val="16"/>
+                <w:szCs w:val="16"/>
+              </w:rPr>
+              <w:t>Dersin</w:t>
+            </w:r>
+            <w:proofErr w:type="spellEnd"/>
+            <w:r>
+              <w:rPr>
+                <w:rFonts w:ascii="Times New Roman" w:hAnsi="Times New Roman" w:cs="Times New Roman"/>
+                <w:b/>
+                <w:sz w:val="16"/>
+                <w:szCs w:val="16"/>
+              </w:rPr>
+              <w:t xml:space="preserve"> </w:t>
+            </w:r>
+            <w:proofErr w:type="spellStart"/>
+            <w:r>
+              <w:rPr>
+                <w:rFonts w:ascii="Times New Roman" w:hAnsi="Times New Roman" w:cs="Times New Roman"/>
+                <w:b/>
+                <w:sz w:val="16"/>
+                <w:szCs w:val="16"/>
+              </w:rPr>
+              <w:t>Adı</w:t>
+            </w:r>
+            <w:proofErr w:type="spellEnd"/>
+          </w:p>
+        </w:tc>
+        <w:tc>
+          <w:tcPr>
+            <w:tcW w:w="2291" w:type="pct"/>
+            <w:tcMar>
+              <w:top w:w="60" w:type="dxa"/>
+              <w:left w:w="80" w:type="dxa"/>
+              <w:bottom w:w="60" w:type="dxa"/>
+              <w:right w:w="80" w:type="dxa"/>
+            </w:tcMar>
+            <w:vAlign w:val="center"/>
+          </w:tcPr>
+          <w:p>
+            <w:pPr>
+              <w:spacing w:after="0" w:line="240" w:lineRule="auto"/>
+              <w:rPr>
+                <w:rFonts w:ascii="Times New Roman" w:hAnsi="Times New Roman" w:cs="Times New Roman"/>
+                <w:b/>
+                <w:sz w:val="16"/>
+                <w:szCs w:val="16"/>
+              </w:rPr>
+            </w:pPr>
+          </w:p>
+        </w:tc>
+        <w:tc>
+          <w:tcPr>
+            <w:tcW w:w="1780" w:type="pct"/>
+            <w:gridSpan w:val="2"/>
+            <w:vAlign w:val="center"/>
+          </w:tcPr>
+          <w:p>
+            <w:pPr>
+              <w:spacing w:after="0" w:line="240" w:lineRule="auto"/>
+              <w:jc w:val="center"/>
+              <w:rPr>
+                <w:rFonts w:ascii="Times New Roman" w:hAnsi="Times New Roman" w:cs="Times New Roman"/>
+                <w:b/>
+                <w:sz w:val="16"/>
+                <w:szCs w:val="16"/>
+              </w:rPr>
+            </w:pPr>
+            <w:r>
+              <w:rPr>
+                <w:rFonts w:ascii="Segoe UI Symbol" w:hAnsi="Segoe UI Symbol" w:cs="Segoe UI Symbol"/>
+                <w:b/>
+                <w:sz w:val="16"/>
+                <w:szCs w:val="16"/>
+              </w:rPr>
+              <w:t>☐</w:t>
+            </w:r>
+            <w:r>
+              <w:rPr>
+                <w:rFonts w:ascii="Times New Roman" w:hAnsi="Times New Roman" w:cs="Times New Roman"/>
+                <w:b/>
+                <w:sz w:val="16"/>
+                <w:szCs w:val="16"/>
+              </w:rPr>
+              <w:t xml:space="preserve"> 1. </w:t>
+            </w:r>
+            <w:proofErr w:type="spellStart"/>
+            <w:proofErr w:type="gramStart"/>
+            <w:r>
+              <w:rPr>
+                <w:rFonts w:ascii="Times New Roman" w:hAnsi="Times New Roman" w:cs="Times New Roman"/>
+                <w:b/>
+                <w:sz w:val="16"/>
+                <w:szCs w:val="16"/>
+              </w:rPr>
+              <w:t>Yazılı</w:t>
+            </w:r>
+            <w:proofErr w:type="spellEnd"/>
+            <w:r>
+              <w:rPr>
+                <w:rFonts w:ascii="Times New Roman" w:hAnsi="Times New Roman" w:cs="Times New Roman"/>
+                <w:b/>
+                <w:sz w:val="16"/>
+                <w:szCs w:val="16"/>
+              </w:rPr>
+              <w:t xml:space="preserve">  </w:t>
+            </w:r>
+            <w:r>
+              <w:rPr>
+                <w:rFonts w:ascii="Segoe UI Symbol" w:hAnsi="Segoe UI Symbol" w:cs="Segoe UI Symbol"/>
+                <w:b/>
+                <w:sz w:val="16"/>
+                <w:szCs w:val="16"/>
+              </w:rPr>
+              <w:t>☐</w:t>
+            </w:r>
+            <w:proofErr w:type="gramEnd"/>
+            <w:r>
+              <w:rPr>
+                <w:rFonts w:ascii="Times New Roman" w:hAnsi="Times New Roman" w:cs="Times New Roman"/>
+                <w:b/>
+                <w:sz w:val="16"/>
+                <w:szCs w:val="16"/>
+              </w:rPr>
+              <w:t xml:space="preserve"> 2. </w:t>
+            </w:r>
+            <w:proofErr w:type="spellStart"/>
+            <w:proofErr w:type="gramStart"/>
+            <w:r>
+              <w:rPr>
+                <w:rFonts w:ascii="Times New Roman" w:hAnsi="Times New Roman" w:cs="Times New Roman"/>
+                <w:b/>
+                <w:sz w:val="16"/>
+                <w:szCs w:val="16"/>
+              </w:rPr>
+              <w:t>Yazılı</w:t>
+            </w:r>
+            <w:proofErr w:type="spellEnd"/>
+            <w:r>
+              <w:rPr>
+                <w:rFonts w:ascii="Times New Roman" w:hAnsi="Times New Roman" w:cs="Times New Roman"/>
+                <w:b/>
+                <w:sz w:val="16"/>
+                <w:szCs w:val="16"/>
+              </w:rPr>
+              <w:t xml:space="preserve">  </w:t>
+            </w:r>
+            <w:r>
+              <w:rPr>
+                <w:rFonts w:ascii="Segoe UI Symbol" w:hAnsi="Segoe UI Symbol" w:cs="Segoe UI Symbol"/>
+                <w:b/>
+                <w:sz w:val="16"/>
+                <w:szCs w:val="16"/>
+              </w:rPr>
+              <w:t>☐</w:t>
+            </w:r>
+            <w:proofErr w:type="gramEnd"/>
+            <w:r>
+              <w:rPr>
+                <w:rFonts w:ascii="Times New Roman" w:hAnsi="Times New Roman" w:cs="Times New Roman"/>
+                <w:b/>
+                <w:sz w:val="16"/>
+                <w:szCs w:val="16"/>
+              </w:rPr>
+              <w:t xml:space="preserve"> </w:t>
+            </w:r>
+            <w:proofErr w:type="spellStart"/>
+            <w:r>
+              <w:rPr>
+                <w:rFonts w:ascii="Times New Roman" w:hAnsi="Times New Roman" w:cs="Times New Roman"/>
+                <w:b/>
+                <w:sz w:val="16"/>
+                <w:szCs w:val="16"/>
+              </w:rPr>
+              <w:t>Diğer</w:t>
+            </w:r>
+            <w:proofErr w:type="spellEnd"/>
+            <w:r>
+              <w:rPr>
+                <w:rFonts w:ascii="Times New Roman" w:hAnsi="Times New Roman" w:cs="Times New Roman"/>
+                <w:b/>
+                <w:sz w:val="16"/>
+                <w:szCs w:val="16"/>
+              </w:rPr>
+              <w:t>:</w:t>
             </w:r>
           </w:p>
         </w:tc>
@@ -893,7 +1138,18 @@
         <w:rPr>
           <w:b/>
           <w:color w:val="17365D"/>
-          <w:sz w:val="20"/>
+          <w:sz w:val="21"/>
+        </w:rPr>
+      </w:pPr>
+    </w:p>
+    <w:p>
+      <w:pPr>
+        <w:spacing w:after="40"/>
+        <w:jc w:val="center"/>
+        <w:rPr>
+          <w:b/>
+          <w:color w:val="17365D"/>
+          <w:sz w:val="21"/>
         </w:rPr>
       </w:pPr>
     </w:p>
@@ -904,21 +1160,55 @@
       </w:pPr>
       <w:r>
         <w:rPr>
-          <w:rFonts w:ascii="Arial" w:hAnsi="Arial"/>
           <w:b/>
           <w:color w:val="17365D"/>
           <w:sz w:val="21"/>
         </w:rPr>
-        <w:t>SORU BAZLI PUANLAR</w:t>
+        <w:t xml:space="preserve">SORU BAZLI </w:t>
+      </w:r>
+      <w:proofErr w:type="gramStart"/>
+      <w:r>
+        <w:rPr>
+          <w:b/>
+          <w:color w:val="17365D"/>
+          <w:sz w:val="21"/>
+        </w:rPr>
+        <w:t>PUANLAR</w:t>
       </w:r>
       <w:r>
         <w:rPr>
-          <w:rFonts w:ascii="Arial" w:hAnsi="Arial"/>
           <w:b/>
           <w:color w:val="006D77"/>
           <w:sz w:val="16"/>
         </w:rPr>
-        <w:t xml:space="preserve">  ·  KVKK: Yalnız okul numarası kullanınız; öğrenci ad-soyadı ve T.C. kimlik numarası yazmayınız.</w:t>
+        <w:t xml:space="preserve">  ·</w:t>
+      </w:r>
+      <w:proofErr w:type="gramEnd"/>
+      <w:r>
+        <w:rPr>
+          <w:b/>
+          <w:color w:val="006D77"/>
+          <w:sz w:val="16"/>
+        </w:rPr>
+        <w:t xml:space="preserve">  KVKK: </w:t>
+      </w:r>
+      <w:proofErr w:type="spellStart"/>
+      <w:r>
+        <w:rPr>
+          <w:b/>
+          <w:color w:val="006D77"/>
+          <w:sz w:val="16"/>
+        </w:rPr>
+        <w:t>Yalnız</w:t>
+      </w:r>
+      <w:proofErr w:type="spellEnd"/>
+      <w:r>
+        <w:rPr>
+          <w:b/>
+          <w:color w:val="006D77"/>
+          <w:sz w:val="16"/>
+        </w:rPr>
+        <w:t xml:space="preserve"> okul numarası kullanınız; öğrenci ad-soyadı ve T.C. kimlik numarası yazmayınız.</w:t>
       </w:r>
     </w:p>
     <w:tbl>
@@ -973,7 +1263,6 @@
               <w:spacing w:after="0" w:line="240" w:lineRule="auto"/>
               <w:jc w:val="center"/>
             </w:pPr>
-            <w:proofErr w:type="spellStart"/>
             <w:r>
               <w:rPr>
                 <w:b/>
@@ -982,7 +1271,6 @@
               </w:rPr>
               <w:t>Sıra</w:t>
             </w:r>
-            <w:proofErr w:type="spellEnd"/>
           </w:p>
         </w:tc>
         <w:tc>
@@ -1030,7 +1318,6 @@
             </w:pPr>
             <w:r>
               <w:rPr>
-                <w:rFonts w:ascii="Arial" w:hAnsi="Arial"/>
                 <w:b/>
                 <w:color w:val="FFFFFF"/>
                 <w:sz w:val="11"/>
@@ -1057,7 +1344,6 @@
             </w:pPr>
             <w:r>
               <w:rPr>
-                <w:rFonts w:ascii="Arial" w:hAnsi="Arial"/>
                 <w:b/>
                 <w:color w:val="FFFFFF"/>
                 <w:sz w:val="11"/>
@@ -1084,7 +1370,6 @@
             </w:pPr>
             <w:r>
               <w:rPr>
-                <w:rFonts w:ascii="Arial" w:hAnsi="Arial"/>
                 <w:b/>
                 <w:color w:val="FFFFFF"/>
                 <w:sz w:val="11"/>
@@ -1111,7 +1396,6 @@
             </w:pPr>
             <w:r>
               <w:rPr>
-                <w:rFonts w:ascii="Arial" w:hAnsi="Arial"/>
                 <w:b/>
                 <w:color w:val="FFFFFF"/>
                 <w:sz w:val="11"/>
@@ -1138,7 +1422,6 @@
             </w:pPr>
             <w:r>
               <w:rPr>
-                <w:rFonts w:ascii="Arial" w:hAnsi="Arial"/>
                 <w:b/>
                 <w:color w:val="FFFFFF"/>
                 <w:sz w:val="11"/>
@@ -1165,7 +1448,6 @@
             </w:pPr>
             <w:r>
               <w:rPr>
-                <w:rFonts w:ascii="Arial" w:hAnsi="Arial"/>
                 <w:b/>
                 <w:color w:val="FFFFFF"/>
                 <w:sz w:val="11"/>
@@ -1192,7 +1474,6 @@
             </w:pPr>
             <w:r>
               <w:rPr>
-                <w:rFonts w:ascii="Arial" w:hAnsi="Arial"/>
                 <w:b/>
                 <w:color w:val="FFFFFF"/>
                 <w:sz w:val="11"/>
@@ -1219,7 +1500,6 @@
             </w:pPr>
             <w:r>
               <w:rPr>
-                <w:rFonts w:ascii="Arial" w:hAnsi="Arial"/>
                 <w:b/>
                 <w:color w:val="FFFFFF"/>
                 <w:sz w:val="11"/>
@@ -1246,7 +1526,6 @@
             </w:pPr>
             <w:r>
               <w:rPr>
-                <w:rFonts w:ascii="Arial" w:hAnsi="Arial"/>
                 <w:b/>
                 <w:color w:val="FFFFFF"/>
                 <w:sz w:val="11"/>
@@ -1273,7 +1552,6 @@
             </w:pPr>
             <w:r>
               <w:rPr>
-                <w:rFonts w:ascii="Arial" w:hAnsi="Arial"/>
                 <w:b/>
                 <w:color w:val="FFFFFF"/>
                 <w:sz w:val="11"/>
@@ -10225,7 +10503,7 @@
 </file>
 
 <file path=word/endnotes.xml><?xml version="1.0" encoding="utf-8"?>
-<w:endnotes xmlns:wpc="http://schemas.microsoft.com/office/word/2010/wordprocessingCanvas" xmlns:cx="http://schemas.microsoft.com/office/drawing/2014/chartex" xmlns:cx1="http://schemas.microsoft.com/office/drawing/2015/9/8/chartex" xmlns:cx2="http://schemas.microsoft.com/office/drawing/2015/10/21/chartex" xmlns:cx3="http://schemas.microsoft.com/office/drawing/2016/5/9/chartex" xmlns:cx4="http://schemas.microsoft.com/office/drawing/2016/5/10/chartex" xmlns:cx5="http://schemas.microsoft.com/office/drawing/2016/5/11/chartex" xmlns:cx6="http://schemas.microsoft.com/office/drawing/2016/5/12/chartex" xmlns:cx7="http://schemas.microsoft.com/office/drawing/2016/5/13/chartex" xmlns:cx8="http://schemas.microsoft.com/office/drawing/2016/5/14/chartex" xmlns:mc="http://schemas.openxmlformats.org/markup-compatibility/2006" xmlns:aink="http://schemas.microsoft.com/office/drawing/2016/ink" xmlns:am3d="http://schemas.microsoft.com/office/drawing/2017/model3d" xmlns:o="urn:schemas-microsoft-com:office:office" xmlns:oel="http://schemas.microsoft.com/office/2019/extlst" xmlns:r="http://schemas.openxmlformats.org/officeDocument/2006/relationships" xmlns:m="http://schemas.openxmlformats.org/officeDocument/2006/math" xmlns:v="urn:schemas-microsoft-com:vml" xmlns:wp14="http://schemas.microsoft.com/office/word/2010/wordprocessingDrawing" xmlns:wp="http://schemas.openxmlformats.org/drawingml/2006/wordprocessingDrawing" xmlns:w10="urn:schemas-microsoft-com:office:word" xmlns:w="http://schemas.openxmlformats.org/wordprocessingml/2006/main" xmlns:w14="http://schemas.microsoft.com/office/word/2010/wordml" xmlns:w15="http://schemas.microsoft.com/office/word/2012/wordml" xmlns:w16cei="http://schemas.microsoft.com/office/word/2026/wordml/cei" xmlns:w16cex="http://schemas.microsoft.com/office/word/2018/wordml/cex" xmlns:w16cid="http://schemas.microsoft.com/office/word/2016/wordml/cid" xmlns:w16="http://schemas.microsoft.com/office/word/2018/wordml" xmlns:w16du="http://schemas.microsoft.com/office/word/2023/wordml/word16du" xmlns:w16sdtdh="http://schemas.microsoft.com/office/word/2020/wordml/sdtdatahash" xmlns:w16sdtfl="http://schemas.microsoft.com/office/word/2024/wordml/sdtformatlock" xmlns:w16se="http://schemas.microsoft.com/office/word/2015/wordml/symex" xmlns:wpg="http://schemas.microsoft.com/office/word/2010/wordprocessingGroup" xmlns:wpi="http://schemas.microsoft.com/office/word/2010/wordprocessingInk" xmlns:wne="http://schemas.microsoft.com/office/word/2006/wordml" xmlns:wps="http://schemas.microsoft.com/office/word/2010/wordprocessingShape" mc:Ignorable="w14 w15 w16se w16cid w16 w16cex w16sdtdh w16sdtfl w16du wp14">
+<w:endnotes xmlns:wpc="http://schemas.microsoft.com/office/word/2010/wordprocessingCanvas" xmlns:cx="http://schemas.microsoft.com/office/drawing/2014/chartex" xmlns:cx1="http://schemas.microsoft.com/office/drawing/2015/9/8/chartex" xmlns:cx2="http://schemas.microsoft.com/office/drawing/2015/10/21/chartex" xmlns:cx3="http://schemas.microsoft.com/office/drawing/2016/5/9/chartex" xmlns:cx4="http://schemas.microsoft.com/office/drawing/2016/5/10/chartex" xmlns:cx5="http://schemas.microsoft.com/office/drawing/2016/5/11/chartex" xmlns:cx6="http://schemas.microsoft.com/office/drawing/2016/5/12/chartex" xmlns:cx7="http://schemas.microsoft.com/office/drawing/2016/5/13/chartex" xmlns:cx8="http://schemas.microsoft.com/office/drawing/2016/5/14/chartex" xmlns:mc="http://schemas.openxmlformats.org/markup-compatibility/2006" xmlns:aink="http://schemas.microsoft.com/office/drawing/2016/ink" xmlns:am3d="http://schemas.microsoft.com/office/drawing/2017/model3d" xmlns:o="urn:schemas-microsoft-com:office:office" xmlns:oel="http://schemas.microsoft.com/office/2019/extlst" xmlns:r="http://schemas.openxmlformats.org/officeDocument/2006/relationships" xmlns:m="http://schemas.openxmlformats.org/officeDocument/2006/math" xmlns:v="urn:schemas-microsoft-com:vml" xmlns:wp14="http://schemas.microsoft.com/office/word/2010/wordprocessingDrawing" xmlns:wp="http://schemas.openxmlformats.org/drawingml/2006/wordprocessingDrawing" xmlns:w10="urn:schemas-microsoft-com:office:word" xmlns:w="http://schemas.openxmlformats.org/wordprocessingml/2006/main" xmlns:w14="http://schemas.microsoft.com/office/word/2010/wordml" xmlns:w15="http://schemas.microsoft.com/office/word/2012/wordml" xmlns:w16cex="http://schemas.microsoft.com/office/word/2018/wordml/cex" xmlns:w16cid="http://schemas.microsoft.com/office/word/2016/wordml/cid" xmlns:w16="http://schemas.microsoft.com/office/word/2018/wordml" xmlns:w16du="http://schemas.microsoft.com/office/word/2023/wordml/word16du" xmlns:w16sdtdh="http://schemas.microsoft.com/office/word/2020/wordml/sdtdatahash" xmlns:w16sdtfl="http://schemas.microsoft.com/office/word/2024/wordml/sdtformatlock" xmlns:w16se="http://schemas.microsoft.com/office/word/2015/wordml/symex" xmlns:wpg="http://schemas.microsoft.com/office/word/2010/wordprocessingGroup" xmlns:wpi="http://schemas.microsoft.com/office/word/2010/wordprocessingInk" xmlns:wne="http://schemas.microsoft.com/office/word/2006/wordml" xmlns:wps="http://schemas.microsoft.com/office/word/2010/wordprocessingShape" mc:Ignorable="w14 w15 w16se w16cid w16 w16cex w16sdtdh w16sdtfl w16du wp14">
   <w:endnote w:type="separator" w:id="-1">
     <w:p>
       <w:pPr>
@@ -10250,7 +10528,7 @@
 </file>
 
 <file path=word/footer1.xml><?xml version="1.0" encoding="utf-8"?>
-<w:ftr xmlns:wpc="http://schemas.microsoft.com/office/word/2010/wordprocessingCanvas" xmlns:cx="http://schemas.microsoft.com/office/drawing/2014/chartex" xmlns:cx1="http://schemas.microsoft.com/office/drawing/2015/9/8/chartex" xmlns:cx2="http://schemas.microsoft.com/office/drawing/2015/10/21/chartex" xmlns:cx3="http://schemas.microsoft.com/office/drawing/2016/5/9/chartex" xmlns:cx4="http://schemas.microsoft.com/office/drawing/2016/5/10/chartex" xmlns:cx5="http://schemas.microsoft.com/office/drawing/2016/5/11/chartex" xmlns:cx6="http://schemas.microsoft.com/office/drawing/2016/5/12/chartex" xmlns:cx7="http://schemas.microsoft.com/office/drawing/2016/5/13/chartex" xmlns:cx8="http://schemas.microsoft.com/office/drawing/2016/5/14/chartex" xmlns:mc="http://schemas.openxmlformats.org/markup-compatibility/2006" xmlns:aink="http://schemas.microsoft.com/office/drawing/2016/ink" xmlns:am3d="http://schemas.microsoft.com/office/drawing/2017/model3d" xmlns:o="urn:schemas-microsoft-com:office:office" xmlns:oel="http://schemas.microsoft.com/office/2019/extlst" xmlns:r="http://schemas.openxmlformats.org/officeDocument/2006/relationships" xmlns:m="http://schemas.openxmlformats.org/officeDocument/2006/math" xmlns:v="urn:schemas-microsoft-com:vml" xmlns:wp14="http://schemas.microsoft.com/office/word/2010/wordprocessingDrawing" xmlns:wp="http://schemas.openxmlformats.org/drawingml/2006/wordprocessingDrawing" xmlns:w10="urn:schemas-microsoft-com:office:word" xmlns:w="http://schemas.openxmlformats.org/wordprocessingml/2006/main" xmlns:w14="http://schemas.microsoft.com/office/word/2010/wordml" xmlns:w15="http://schemas.microsoft.com/office/word/2012/wordml" xmlns:w16cei="http://schemas.microsoft.com/office/word/2026/wordml/cei" xmlns:w16cex="http://schemas.microsoft.com/office/word/2018/wordml/cex" xmlns:w16cid="http://schemas.microsoft.com/office/word/2016/wordml/cid" xmlns:w16="http://schemas.microsoft.com/office/word/2018/wordml" xmlns:w16du="http://schemas.microsoft.com/office/word/2023/wordml/word16du" xmlns:w16sdtdh="http://schemas.microsoft.com/office/word/2020/wordml/sdtdatahash" xmlns:w16sdtfl="http://schemas.microsoft.com/office/word/2024/wordml/sdtformatlock" xmlns:w16se="http://schemas.microsoft.com/office/word/2015/wordml/symex" xmlns:wpg="http://schemas.microsoft.com/office/word/2010/wordprocessingGroup" xmlns:wpi="http://schemas.microsoft.com/office/word/2010/wordprocessingInk" xmlns:wne="http://schemas.microsoft.com/office/word/2006/wordml" xmlns:wps="http://schemas.microsoft.com/office/word/2010/wordprocessingShape" mc:Ignorable="w14 w15 w16se w16cid w16 w16cex w16sdtdh w16sdtfl w16du wp14">
+<w:ftr xmlns:wpc="http://schemas.microsoft.com/office/word/2010/wordprocessingCanvas" xmlns:cx="http://schemas.microsoft.com/office/drawing/2014/chartex" xmlns:cx1="http://schemas.microsoft.com/office/drawing/2015/9/8/chartex" xmlns:cx2="http://schemas.microsoft.com/office/drawing/2015/10/21/chartex" xmlns:cx3="http://schemas.microsoft.com/office/drawing/2016/5/9/chartex" xmlns:cx4="http://schemas.microsoft.com/office/drawing/2016/5/10/chartex" xmlns:cx5="http://schemas.microsoft.com/office/drawing/2016/5/11/chartex" xmlns:cx6="http://schemas.microsoft.com/office/drawing/2016/5/12/chartex" xmlns:cx7="http://schemas.microsoft.com/office/drawing/2016/5/13/chartex" xmlns:cx8="http://schemas.microsoft.com/office/drawing/2016/5/14/chartex" xmlns:mc="http://schemas.openxmlformats.org/markup-compatibility/2006" xmlns:aink="http://schemas.microsoft.com/office/drawing/2016/ink" xmlns:am3d="http://schemas.microsoft.com/office/drawing/2017/model3d" xmlns:o="urn:schemas-microsoft-com:office:office" xmlns:oel="http://schemas.microsoft.com/office/2019/extlst" xmlns:r="http://schemas.openxmlformats.org/officeDocument/2006/relationships" xmlns:m="http://schemas.openxmlformats.org/officeDocument/2006/math" xmlns:v="urn:schemas-microsoft-com:vml" xmlns:wp14="http://schemas.microsoft.com/office/word/2010/wordprocessingDrawing" xmlns:wp="http://schemas.openxmlformats.org/drawingml/2006/wordprocessingDrawing" xmlns:w10="urn:schemas-microsoft-com:office:word" xmlns:w="http://schemas.openxmlformats.org/wordprocessingml/2006/main" xmlns:w14="http://schemas.microsoft.com/office/word/2010/wordml" xmlns:w15="http://schemas.microsoft.com/office/word/2012/wordml" xmlns:w16cex="http://schemas.microsoft.com/office/word/2018/wordml/cex" xmlns:w16cid="http://schemas.microsoft.com/office/word/2016/wordml/cid" xmlns:w16="http://schemas.microsoft.com/office/word/2018/wordml" xmlns:w16du="http://schemas.microsoft.com/office/word/2023/wordml/word16du" xmlns:w16sdtdh="http://schemas.microsoft.com/office/word/2020/wordml/sdtdatahash" xmlns:w16sdtfl="http://schemas.microsoft.com/office/word/2024/wordml/sdtformatlock" xmlns:w16se="http://schemas.microsoft.com/office/word/2015/wordml/symex" xmlns:wpg="http://schemas.microsoft.com/office/word/2010/wordprocessingGroup" xmlns:wpi="http://schemas.microsoft.com/office/word/2010/wordprocessingInk" xmlns:wne="http://schemas.microsoft.com/office/word/2006/wordml" xmlns:wps="http://schemas.microsoft.com/office/word/2010/wordprocessingShape" mc:Ignorable="w14 w15 w16se w16cid w16 w16cex w16sdtdh w16sdtfl w16du wp14">
   <w:p>
     <w:pPr>
       <w:pStyle w:val="AltBilgi"/>
@@ -10261,7 +10539,7 @@
 </file>
 
 <file path=word/footnotes.xml><?xml version="1.0" encoding="utf-8"?>
-<w:footnotes xmlns:wpc="http://schemas.microsoft.com/office/word/2010/wordprocessingCanvas" xmlns:cx="http://schemas.microsoft.com/office/drawing/2014/chartex" xmlns:cx1="http://schemas.microsoft.com/office/drawing/2015/9/8/chartex" xmlns:cx2="http://schemas.microsoft.com/office/drawing/2015/10/21/chartex" xmlns:cx3="http://schemas.microsoft.com/office/drawing/2016/5/9/chartex" xmlns:cx4="http://schemas.microsoft.com/office/drawing/2016/5/10/chartex" xmlns:cx5="http://schemas.microsoft.com/office/drawing/2016/5/11/chartex" xmlns:cx6="http://schemas.microsoft.com/office/drawing/2016/5/12/chartex" xmlns:cx7="http://schemas.microsoft.com/office/drawing/2016/5/13/chartex" xmlns:cx8="http://schemas.microsoft.com/office/drawing/2016/5/14/chartex" xmlns:mc="http://schemas.openxmlformats.org/markup-compatibility/2006" xmlns:aink="http://schemas.microsoft.com/office/drawing/2016/ink" xmlns:am3d="http://schemas.microsoft.com/office/drawing/2017/model3d" xmlns:o="urn:schemas-microsoft-com:office:office" xmlns:oel="http://schemas.microsoft.com/office/2019/extlst" xmlns:r="http://schemas.openxmlformats.org/officeDocument/2006/relationships" xmlns:m="http://schemas.openxmlformats.org/officeDocument/2006/math" xmlns:v="urn:schemas-microsoft-com:vml" xmlns:wp14="http://schemas.microsoft.com/office/word/2010/wordprocessingDrawing" xmlns:wp="http://schemas.openxmlformats.org/drawingml/2006/wordprocessingDrawing" xmlns:w10="urn:schemas-microsoft-com:office:word" xmlns:w="http://schemas.openxmlformats.org/wordprocessingml/2006/main" xmlns:w14="http://schemas.microsoft.com/office/word/2010/wordml" xmlns:w15="http://schemas.microsoft.com/office/word/2012/wordml" xmlns:w16cei="http://schemas.microsoft.com/office/word/2026/wordml/cei" xmlns:w16cex="http://schemas.microsoft.com/office/word/2018/wordml/cex" xmlns:w16cid="http://schemas.microsoft.com/office/word/2016/wordml/cid" xmlns:w16="http://schemas.microsoft.com/office/word/2018/wordml" xmlns:w16du="http://schemas.microsoft.com/office/word/2023/wordml/word16du" xmlns:w16sdtdh="http://schemas.microsoft.com/office/word/2020/wordml/sdtdatahash" xmlns:w16sdtfl="http://schemas.microsoft.com/office/word/2024/wordml/sdtformatlock" xmlns:w16se="http://schemas.microsoft.com/office/word/2015/wordml/symex" xmlns:wpg="http://schemas.microsoft.com/office/word/2010/wordprocessingGroup" xmlns:wpi="http://schemas.microsoft.com/office/word/2010/wordprocessingInk" xmlns:wne="http://schemas.microsoft.com/office/word/2006/wordml" xmlns:wps="http://schemas.microsoft.com/office/word/2010/wordprocessingShape" mc:Ignorable="w14 w15 w16se w16cid w16 w16cex w16sdtdh w16sdtfl w16du wp14">
+<w:footnotes xmlns:wpc="http://schemas.microsoft.com/office/word/2010/wordprocessingCanvas" xmlns:cx="http://schemas.microsoft.com/office/drawing/2014/chartex" xmlns:cx1="http://schemas.microsoft.com/office/drawing/2015/9/8/chartex" xmlns:cx2="http://schemas.microsoft.com/office/drawing/2015/10/21/chartex" xmlns:cx3="http://schemas.microsoft.com/office/drawing/2016/5/9/chartex" xmlns:cx4="http://schemas.microsoft.com/office/drawing/2016/5/10/chartex" xmlns:cx5="http://schemas.microsoft.com/office/drawing/2016/5/11/chartex" xmlns:cx6="http://schemas.microsoft.com/office/drawing/2016/5/12/chartex" xmlns:cx7="http://schemas.microsoft.com/office/drawing/2016/5/13/chartex" xmlns:cx8="http://schemas.microsoft.com/office/drawing/2016/5/14/chartex" xmlns:mc="http://schemas.openxmlformats.org/markup-compatibility/2006" xmlns:aink="http://schemas.microsoft.com/office/drawing/2016/ink" xmlns:am3d="http://schemas.microsoft.com/office/drawing/2017/model3d" xmlns:o="urn:schemas-microsoft-com:office:office" xmlns:oel="http://schemas.microsoft.com/office/2019/extlst" xmlns:r="http://schemas.openxmlformats.org/officeDocument/2006/relationships" xmlns:m="http://schemas.openxmlformats.org/officeDocument/2006/math" xmlns:v="urn:schemas-microsoft-com:vml" xmlns:wp14="http://schemas.microsoft.com/office/word/2010/wordprocessingDrawing" xmlns:wp="http://schemas.openxmlformats.org/drawingml/2006/wordprocessingDrawing" xmlns:w10="urn:schemas-microsoft-com:office:word" xmlns:w="http://schemas.openxmlformats.org/wordprocessingml/2006/main" xmlns:w14="http://schemas.microsoft.com/office/word/2010/wordml" xmlns:w15="http://schemas.microsoft.com/office/word/2012/wordml" xmlns:w16cex="http://schemas.microsoft.com/office/word/2018/wordml/cex" xmlns:w16cid="http://schemas.microsoft.com/office/word/2016/wordml/cid" xmlns:w16="http://schemas.microsoft.com/office/word/2018/wordml" xmlns:w16du="http://schemas.microsoft.com/office/word/2023/wordml/word16du" xmlns:w16sdtdh="http://schemas.microsoft.com/office/word/2020/wordml/sdtdatahash" xmlns:w16sdtfl="http://schemas.microsoft.com/office/word/2024/wordml/sdtformatlock" xmlns:w16se="http://schemas.microsoft.com/office/word/2015/wordml/symex" xmlns:wpg="http://schemas.microsoft.com/office/word/2010/wordprocessingGroup" xmlns:wpi="http://schemas.microsoft.com/office/word/2010/wordprocessingInk" xmlns:wne="http://schemas.microsoft.com/office/word/2006/wordml" xmlns:wps="http://schemas.microsoft.com/office/word/2010/wordprocessingShape" mc:Ignorable="w14 w15 w16se w16cid w16 w16cex w16sdtdh w16sdtfl w16du wp14">
   <w:footnote w:type="separator" w:id="-1">
     <w:p>
       <w:pPr>
@@ -10286,7 +10564,7 @@
 </file>
 
 <file path=word/numbering.xml><?xml version="1.0" encoding="utf-8"?>
-<w:numbering xmlns:wpc="http://schemas.microsoft.com/office/word/2010/wordprocessingCanvas" xmlns:cx="http://schemas.microsoft.com/office/drawing/2014/chartex" xmlns:cx1="http://schemas.microsoft.com/office/drawing/2015/9/8/chartex" xmlns:cx2="http://schemas.microsoft.com/office/drawing/2015/10/21/chartex" xmlns:cx3="http://schemas.microsoft.com/office/drawing/2016/5/9/chartex" xmlns:cx4="http://schemas.microsoft.com/office/drawing/2016/5/10/chartex" xmlns:cx5="http://schemas.microsoft.com/office/drawing/2016/5/11/chartex" xmlns:cx6="http://schemas.microsoft.com/office/drawing/2016/5/12/chartex" xmlns:cx7="http://schemas.microsoft.com/office/drawing/2016/5/13/chartex" xmlns:cx8="http://schemas.microsoft.com/office/drawing/2016/5/14/chartex" xmlns:mc="http://schemas.openxmlformats.org/markup-compatibility/2006" xmlns:aink="http://schemas.microsoft.com/office/drawing/2016/ink" xmlns:am3d="http://schemas.microsoft.com/office/drawing/2017/model3d" xmlns:o="urn:schemas-microsoft-com:office:office" xmlns:oel="http://schemas.microsoft.com/office/2019/extlst" xmlns:r="http://schemas.openxmlformats.org/officeDocument/2006/relationships" xmlns:m="http://schemas.openxmlformats.org/officeDocument/2006/math" xmlns:v="urn:schemas-microsoft-com:vml" xmlns:wp14="http://schemas.microsoft.com/office/word/2010/wordprocessingDrawing" xmlns:wp="http://schemas.openxmlformats.org/drawingml/2006/wordprocessingDrawing" xmlns:w10="urn:schemas-microsoft-com:office:word" xmlns:w="http://schemas.openxmlformats.org/wordprocessingml/2006/main" xmlns:w14="http://schemas.microsoft.com/office/word/2010/wordml" xmlns:w15="http://schemas.microsoft.com/office/word/2012/wordml" xmlns:w16cei="http://schemas.microsoft.com/office/word/2026/wordml/cei" xmlns:w16cex="http://schemas.microsoft.com/office/word/2018/wordml/cex" xmlns:w16cid="http://schemas.microsoft.com/office/word/2016/wordml/cid" xmlns:w16="http://schemas.microsoft.com/office/word/2018/wordml" xmlns:w16du="http://schemas.microsoft.com/office/word/2023/wordml/word16du" xmlns:w16sdtdh="http://schemas.microsoft.com/office/word/2020/wordml/sdtdatahash" xmlns:w16sdtfl="http://schemas.microsoft.com/office/word/2024/wordml/sdtformatlock" xmlns:w16se="http://schemas.microsoft.com/office/word/2015/wordml/symex" xmlns:wpg="http://schemas.microsoft.com/office/word/2010/wordprocessingGroup" xmlns:wpi="http://schemas.microsoft.com/office/word/2010/wordprocessingInk" xmlns:wne="http://schemas.microsoft.com/office/word/2006/wordml" xmlns:wps="http://schemas.microsoft.com/office/word/2010/wordprocessingShape" mc:Ignorable="w14 w15 w16se w16cid w16 w16cex w16sdtdh w16sdtfl w16du wp14">
+<w:numbering xmlns:wpc="http://schemas.microsoft.com/office/word/2010/wordprocessingCanvas" xmlns:cx="http://schemas.microsoft.com/office/drawing/2014/chartex" xmlns:cx1="http://schemas.microsoft.com/office/drawing/2015/9/8/chartex" xmlns:cx2="http://schemas.microsoft.com/office/drawing/2015/10/21/chartex" xmlns:cx3="http://schemas.microsoft.com/office/drawing/2016/5/9/chartex" xmlns:cx4="http://schemas.microsoft.com/office/drawing/2016/5/10/chartex" xmlns:cx5="http://schemas.microsoft.com/office/drawing/2016/5/11/chartex" xmlns:cx6="http://schemas.microsoft.com/office/drawing/2016/5/12/chartex" xmlns:cx7="http://schemas.microsoft.com/office/drawing/2016/5/13/chartex" xmlns:cx8="http://schemas.microsoft.com/office/drawing/2016/5/14/chartex" xmlns:mc="http://schemas.openxmlformats.org/markup-compatibility/2006" xmlns:aink="http://schemas.microsoft.com/office/drawing/2016/ink" xmlns:am3d="http://schemas.microsoft.com/office/drawing/2017/model3d" xmlns:o="urn:schemas-microsoft-com:office:office" xmlns:oel="http://schemas.microsoft.com/office/2019/extlst" xmlns:r="http://schemas.openxmlformats.org/officeDocument/2006/relationships" xmlns:m="http://schemas.openxmlformats.org/officeDocument/2006/math" xmlns:v="urn:schemas-microsoft-com:vml" xmlns:wp14="http://schemas.microsoft.com/office/word/2010/wordprocessingDrawing" xmlns:wp="http://schemas.openxmlformats.org/drawingml/2006/wordprocessingDrawing" xmlns:w10="urn:schemas-microsoft-com:office:word" xmlns:w="http://schemas.openxmlformats.org/wordprocessingml/2006/main" xmlns:w14="http://schemas.microsoft.com/office/word/2010/wordml" xmlns:w15="http://schemas.microsoft.com/office/word/2012/wordml" xmlns:w16cex="http://schemas.microsoft.com/office/word/2018/wordml/cex" xmlns:w16cid="http://schemas.microsoft.com/office/word/2016/wordml/cid" xmlns:w16="http://schemas.microsoft.com/office/word/2018/wordml" xmlns:w16du="http://schemas.microsoft.com/office/word/2023/wordml/word16du" xmlns:w16sdtdh="http://schemas.microsoft.com/office/word/2020/wordml/sdtdatahash" xmlns:w16sdtfl="http://schemas.microsoft.com/office/word/2024/wordml/sdtformatlock" xmlns:w16se="http://schemas.microsoft.com/office/word/2015/wordml/symex" xmlns:wpg="http://schemas.microsoft.com/office/word/2010/wordprocessingGroup" xmlns:wpi="http://schemas.microsoft.com/office/word/2010/wordprocessingInk" xmlns:wne="http://schemas.microsoft.com/office/word/2006/wordml" xmlns:wps="http://schemas.microsoft.com/office/word/2010/wordprocessingShape" mc:Ignorable="w14 w15 w16se w16cid w16 w16cex w16sdtdh w16sdtfl w16du wp14">
   <w:abstractNum w:abstractNumId="0" w15:restartNumberingAfterBreak="0">
     <w:nsid w:val="FFFFFF7C"/>
     <w:multiLevelType w:val="singleLevel"/>

</xml_diff>